<commit_message>
Minimal IK not working...
</commit_message>
<xml_diff>
--- a/DRAFT/IDEAS.docx
+++ b/DRAFT/IDEAS.docx
@@ -517,25 +517,231 @@
         </w:rPr>
         <w:t>, μαζί με ότι άλλο προκύψει!</w:t>
       </w:r>
-    </w:p>
-    <w:p/>
-    <w:p/>
-    <w:p/>
-    <w:p/>
-    <w:p/>
-    <w:p/>
-    <w:p/>
-    <w:p/>
-    <w:p/>
-    <w:p/>
-    <w:p/>
-    <w:p/>
-    <w:p/>
-    <w:p/>
-    <w:p/>
-    <w:p/>
-    <w:p/>
-    <w:p/>
+      <w:r>
+        <w:rPr>
+          <w:b/>
+          <w:bCs/>
+        </w:rPr>
+        <w:t xml:space="preserve"> - </w:t>
+      </w:r>
+      <w:r>
+        <w:rPr>
+          <w:b/>
+          <w:bCs/>
+          <w:lang w:val="en-US"/>
+        </w:rPr>
+        <w:t>DONE</w:t>
+      </w:r>
+    </w:p>
+    <w:p/>
+    <w:p/>
+    <w:p/>
+    <w:p/>
+    <w:p/>
+    <w:p/>
+    <w:p/>
+    <w:p/>
+    <w:p/>
+    <w:p/>
+    <w:p>
+      <w:pPr>
+        <w:pStyle w:val="Heading1"/>
+        <w:rPr>
+          <w:lang w:val="en-US"/>
+        </w:rPr>
+      </w:pPr>
+      <w:r>
+        <w:rPr>
+          <w:lang w:val="en-US"/>
+        </w:rPr>
+        <w:lastRenderedPageBreak/>
+        <w:t>MANO in detail</w:t>
+      </w:r>
+    </w:p>
+    <w:p>
+      <w:pPr>
+        <w:rPr>
+          <w:lang w:val="en-US"/>
+        </w:rPr>
+      </w:pPr>
+    </w:p>
+    <w:p>
+      <w:pPr>
+        <w:jc w:val="center"/>
+        <w:rPr>
+          <w:lang w:val="en-US"/>
+        </w:rPr>
+      </w:pPr>
+      <w:r>
+        <w:rPr>
+          <w:lang w:val="en-US"/>
+        </w:rPr>
+        <w:drawing>
+          <wp:inline distT="0" distB="0" distL="0" distR="0" wp14:anchorId="266EB7D6" wp14:editId="546514E1">
+            <wp:extent cx="5115600" cy="2350800"/>
+            <wp:effectExtent l="0" t="0" r="8890" b="0"/>
+            <wp:docPr id="518922766" name="Picture 1" descr="A screenshot of a computer&#10;&#10;AI-generated content may be incorrect."/>
+            <wp:cNvGraphicFramePr>
+              <a:graphicFrameLocks xmlns:a="http://schemas.openxmlformats.org/drawingml/2006/main" noChangeAspect="1"/>
+            </wp:cNvGraphicFramePr>
+            <a:graphic xmlns:a="http://schemas.openxmlformats.org/drawingml/2006/main">
+              <a:graphicData uri="http://schemas.openxmlformats.org/drawingml/2006/picture">
+                <pic:pic xmlns:pic="http://schemas.openxmlformats.org/drawingml/2006/picture">
+                  <pic:nvPicPr>
+                    <pic:cNvPr id="518922766" name="Picture 1" descr="A screenshot of a computer&#10;&#10;AI-generated content may be incorrect."/>
+                    <pic:cNvPicPr/>
+                  </pic:nvPicPr>
+                  <pic:blipFill>
+                    <a:blip r:embed="rId7"/>
+                    <a:stretch>
+                      <a:fillRect/>
+                    </a:stretch>
+                  </pic:blipFill>
+                  <pic:spPr>
+                    <a:xfrm>
+                      <a:off x="0" y="0"/>
+                      <a:ext cx="5115600" cy="2350800"/>
+                    </a:xfrm>
+                    <a:prstGeom prst="rect">
+                      <a:avLst/>
+                    </a:prstGeom>
+                  </pic:spPr>
+                </pic:pic>
+              </a:graphicData>
+            </a:graphic>
+          </wp:inline>
+        </w:drawing>
+      </w:r>
+    </w:p>
+    <w:p/>
+    <w:p>
+      <w:pPr>
+        <w:jc w:val="center"/>
+      </w:pPr>
+      <w:r>
+        <w:drawing>
+          <wp:inline distT="0" distB="0" distL="0" distR="0" wp14:anchorId="0D8507E0" wp14:editId="7992706B">
+            <wp:extent cx="5126400" cy="2257200"/>
+            <wp:effectExtent l="0" t="0" r="0" b="0"/>
+            <wp:docPr id="355570474" name="Picture 1" descr="A black screen with white text&#10;&#10;AI-generated content may be incorrect."/>
+            <wp:cNvGraphicFramePr>
+              <a:graphicFrameLocks xmlns:a="http://schemas.openxmlformats.org/drawingml/2006/main" noChangeAspect="1"/>
+            </wp:cNvGraphicFramePr>
+            <a:graphic xmlns:a="http://schemas.openxmlformats.org/drawingml/2006/main">
+              <a:graphicData uri="http://schemas.openxmlformats.org/drawingml/2006/picture">
+                <pic:pic xmlns:pic="http://schemas.openxmlformats.org/drawingml/2006/picture">
+                  <pic:nvPicPr>
+                    <pic:cNvPr id="355570474" name="Picture 1" descr="A black screen with white text&#10;&#10;AI-generated content may be incorrect."/>
+                    <pic:cNvPicPr/>
+                  </pic:nvPicPr>
+                  <pic:blipFill>
+                    <a:blip r:embed="rId8"/>
+                    <a:stretch>
+                      <a:fillRect/>
+                    </a:stretch>
+                  </pic:blipFill>
+                  <pic:spPr>
+                    <a:xfrm>
+                      <a:off x="0" y="0"/>
+                      <a:ext cx="5126400" cy="2257200"/>
+                    </a:xfrm>
+                    <a:prstGeom prst="rect">
+                      <a:avLst/>
+                    </a:prstGeom>
+                  </pic:spPr>
+                </pic:pic>
+              </a:graphicData>
+            </a:graphic>
+          </wp:inline>
+        </w:drawing>
+      </w:r>
+    </w:p>
+    <w:p/>
+    <w:p>
+      <w:pPr>
+        <w:jc w:val="center"/>
+      </w:pPr>
+      <w:r>
+        <w:drawing>
+          <wp:inline distT="0" distB="0" distL="0" distR="0" wp14:anchorId="631C17C6" wp14:editId="08CC41D3">
+            <wp:extent cx="5108400" cy="1360800"/>
+            <wp:effectExtent l="0" t="0" r="0" b="0"/>
+            <wp:docPr id="1230437677" name="Picture 1" descr="A black background with white text&#10;&#10;AI-generated content may be incorrect."/>
+            <wp:cNvGraphicFramePr>
+              <a:graphicFrameLocks xmlns:a="http://schemas.openxmlformats.org/drawingml/2006/main" noChangeAspect="1"/>
+            </wp:cNvGraphicFramePr>
+            <a:graphic xmlns:a="http://schemas.openxmlformats.org/drawingml/2006/main">
+              <a:graphicData uri="http://schemas.openxmlformats.org/drawingml/2006/picture">
+                <pic:pic xmlns:pic="http://schemas.openxmlformats.org/drawingml/2006/picture">
+                  <pic:nvPicPr>
+                    <pic:cNvPr id="1230437677" name="Picture 1" descr="A black background with white text&#10;&#10;AI-generated content may be incorrect."/>
+                    <pic:cNvPicPr/>
+                  </pic:nvPicPr>
+                  <pic:blipFill>
+                    <a:blip r:embed="rId9"/>
+                    <a:stretch>
+                      <a:fillRect/>
+                    </a:stretch>
+                  </pic:blipFill>
+                  <pic:spPr>
+                    <a:xfrm>
+                      <a:off x="0" y="0"/>
+                      <a:ext cx="5108400" cy="1360800"/>
+                    </a:xfrm>
+                    <a:prstGeom prst="rect">
+                      <a:avLst/>
+                    </a:prstGeom>
+                  </pic:spPr>
+                </pic:pic>
+              </a:graphicData>
+            </a:graphic>
+          </wp:inline>
+        </w:drawing>
+      </w:r>
+    </w:p>
+    <w:p/>
+    <w:p>
+      <w:pPr>
+        <w:jc w:val="center"/>
+      </w:pPr>
+      <w:r>
+        <w:drawing>
+          <wp:inline distT="0" distB="0" distL="0" distR="0" wp14:anchorId="664B198C" wp14:editId="5761EDD5">
+            <wp:extent cx="5133600" cy="2152800"/>
+            <wp:effectExtent l="0" t="0" r="0" b="0"/>
+            <wp:docPr id="487823365" name="Picture 1" descr="A black screen with white text&#10;&#10;AI-generated content may be incorrect."/>
+            <wp:cNvGraphicFramePr>
+              <a:graphicFrameLocks xmlns:a="http://schemas.openxmlformats.org/drawingml/2006/main" noChangeAspect="1"/>
+            </wp:cNvGraphicFramePr>
+            <a:graphic xmlns:a="http://schemas.openxmlformats.org/drawingml/2006/main">
+              <a:graphicData uri="http://schemas.openxmlformats.org/drawingml/2006/picture">
+                <pic:pic xmlns:pic="http://schemas.openxmlformats.org/drawingml/2006/picture">
+                  <pic:nvPicPr>
+                    <pic:cNvPr id="487823365" name="Picture 1" descr="A black screen with white text&#10;&#10;AI-generated content may be incorrect."/>
+                    <pic:cNvPicPr/>
+                  </pic:nvPicPr>
+                  <pic:blipFill>
+                    <a:blip r:embed="rId10"/>
+                    <a:stretch>
+                      <a:fillRect/>
+                    </a:stretch>
+                  </pic:blipFill>
+                  <pic:spPr>
+                    <a:xfrm>
+                      <a:off x="0" y="0"/>
+                      <a:ext cx="5133600" cy="2152800"/>
+                    </a:xfrm>
+                    <a:prstGeom prst="rect">
+                      <a:avLst/>
+                    </a:prstGeom>
+                  </pic:spPr>
+                </pic:pic>
+              </a:graphicData>
+            </a:graphic>
+          </wp:inline>
+        </w:drawing>
+      </w:r>
+    </w:p>
     <w:p/>
     <w:p/>
     <w:p/>
@@ -576,7 +782,7 @@
     <w:p/>
     <w:p/>
     <w:sectPr>
-      <w:footerReference w:type="default" r:id="rId7"/>
+      <w:footerReference w:type="default" r:id="rId11"/>
       <w:pgSz w:w="11906" w:h="16838"/>
       <w:pgMar w:top="720" w:right="720" w:bottom="720" w:left="720" w:header="708" w:footer="708" w:gutter="0"/>
       <w:cols w:space="708"/>

</xml_diff>

<commit_message>
IKNet... BS! No solution yet...
</commit_message>
<xml_diff>
--- a/DRAFT/IDEAS.docx
+++ b/DRAFT/IDEAS.docx
@@ -574,6 +574,7 @@
       </w:pPr>
       <w:r>
         <w:rPr>
+          <w:noProof/>
           <w:lang w:val="en-US"/>
         </w:rPr>
         <w:drawing>
@@ -619,6 +620,9 @@
         <w:jc w:val="center"/>
       </w:pPr>
       <w:r>
+        <w:rPr>
+          <w:noProof/>
+        </w:rPr>
         <w:drawing>
           <wp:inline distT="0" distB="0" distL="0" distR="0" wp14:anchorId="0D8507E0" wp14:editId="7992706B">
             <wp:extent cx="5126400" cy="2257200"/>
@@ -662,6 +666,9 @@
         <w:jc w:val="center"/>
       </w:pPr>
       <w:r>
+        <w:rPr>
+          <w:noProof/>
+        </w:rPr>
         <w:drawing>
           <wp:inline distT="0" distB="0" distL="0" distR="0" wp14:anchorId="631C17C6" wp14:editId="08CC41D3">
             <wp:extent cx="5108400" cy="1360800"/>
@@ -705,6 +712,9 @@
         <w:jc w:val="center"/>
       </w:pPr>
       <w:r>
+        <w:rPr>
+          <w:noProof/>
+        </w:rPr>
         <w:drawing>
           <wp:inline distT="0" distB="0" distL="0" distR="0" wp14:anchorId="664B198C" wp14:editId="5761EDD5">
             <wp:extent cx="5133600" cy="2152800"/>
@@ -744,8 +754,180 @@
     </w:p>
     <w:p/>
     <w:p/>
-    <w:p/>
-    <w:p/>
+    <w:p>
+      <w:r>
+        <w:lastRenderedPageBreak/>
+        <w:t xml:space="preserve">Λοιπόν, μετά το </w:t>
+      </w:r>
+      <w:r>
+        <w:rPr>
+          <w:lang w:val="en-US"/>
+        </w:rPr>
+        <w:t>paper</w:t>
+      </w:r>
+      <w:r>
+        <w:t xml:space="preserve"> </w:t>
+      </w:r>
+      <w:r>
+        <w:t>2003.09572</w:t>
+      </w:r>
+      <w:r>
+        <w:rPr>
+          <w:lang w:val="en-US"/>
+        </w:rPr>
+        <w:t>v</w:t>
+      </w:r>
+      <w:r>
+        <w:t>3.</w:t>
+      </w:r>
+      <w:r>
+        <w:rPr>
+          <w:lang w:val="en-US"/>
+        </w:rPr>
+        <w:t>pdf</w:t>
+      </w:r>
+      <w:r>
+        <w:t xml:space="preserve"> ξέρω ότι η λύση του προβλήματός μου χωρίζεται σε 2 τμήματα. Αυτά είναι το </w:t>
+      </w:r>
+      <w:r>
+        <w:rPr>
+          <w:lang w:val="en-US"/>
+        </w:rPr>
+        <w:t>DetNet</w:t>
+      </w:r>
+      <w:r>
+        <w:t xml:space="preserve">, δηλαδή το </w:t>
+      </w:r>
+      <w:r>
+        <w:rPr>
+          <w:lang w:val="en-US"/>
+        </w:rPr>
+        <w:t>MediaPipe</w:t>
+      </w:r>
+      <w:r>
+        <w:t xml:space="preserve"> </w:t>
+      </w:r>
+      <w:r>
+        <w:t xml:space="preserve">της </w:t>
+      </w:r>
+      <w:r>
+        <w:rPr>
+          <w:lang w:val="en-US"/>
+        </w:rPr>
+        <w:t>Google</w:t>
+      </w:r>
+      <w:r>
+        <w:t xml:space="preserve"> (κομπλέ)</w:t>
+      </w:r>
+      <w:r>
+        <w:t xml:space="preserve">, και το </w:t>
+      </w:r>
+      <w:r>
+        <w:rPr>
+          <w:lang w:val="en-US"/>
+        </w:rPr>
+        <w:t>IKNet</w:t>
+      </w:r>
+      <w:r>
+        <w:t xml:space="preserve"> </w:t>
+      </w:r>
+      <w:r>
+        <w:t xml:space="preserve">για την επίλυση των </w:t>
+      </w:r>
+      <w:r>
+        <w:rPr>
+          <w:lang w:val="en-US"/>
+        </w:rPr>
+        <w:t>Inverse</w:t>
+      </w:r>
+      <w:r>
+        <w:t xml:space="preserve"> </w:t>
+      </w:r>
+      <w:r>
+        <w:rPr>
+          <w:lang w:val="en-US"/>
+        </w:rPr>
+        <w:t>Kinematics</w:t>
+      </w:r>
+      <w:r>
+        <w:t xml:space="preserve"> (αυτό μου λείπει)</w:t>
+      </w:r>
+      <w:r>
+        <w:t xml:space="preserve">. Οπότε, πρέπει κάπως να φτιάξω το </w:t>
+      </w:r>
+      <w:r>
+        <w:rPr>
+          <w:lang w:val="en-US"/>
+        </w:rPr>
+        <w:t>adaptor</w:t>
+      </w:r>
+      <w:r>
+        <w:t xml:space="preserve"> </w:t>
+      </w:r>
+      <w:r>
+        <w:t xml:space="preserve">μεταξύ της εξόδου του </w:t>
+      </w:r>
+      <w:r>
+        <w:rPr>
+          <w:lang w:val="en-US"/>
+        </w:rPr>
+        <w:t>MediaPipe</w:t>
+      </w:r>
+      <w:r>
+        <w:t xml:space="preserve"> </w:t>
+      </w:r>
+      <w:r>
+        <w:t xml:space="preserve">και της μετάφρασης σε </w:t>
+      </w:r>
+      <w:r>
+        <w:t>3</w:t>
+      </w:r>
+      <w:r>
+        <w:rPr>
+          <w:lang w:val="en-US"/>
+        </w:rPr>
+        <w:t>D</w:t>
+      </w:r>
+      <w:r>
+        <w:t xml:space="preserve"> </w:t>
+      </w:r>
+      <w:r>
+        <w:rPr>
+          <w:lang w:val="en-US"/>
+        </w:rPr>
+        <w:t>obj</w:t>
+      </w:r>
+      <w:r>
+        <w:t xml:space="preserve"> </w:t>
+      </w:r>
+      <w:r>
+        <w:t xml:space="preserve">του </w:t>
+      </w:r>
+      <w:r>
+        <w:rPr>
+          <w:lang w:val="en-US"/>
+        </w:rPr>
+        <w:t>MANO</w:t>
+      </w:r>
+      <w:r>
+        <w:t>…</w:t>
+      </w:r>
+    </w:p>
+    <w:p>
+      <w:pPr>
+        <w:rPr>
+          <w:lang w:val="en-US"/>
+        </w:rPr>
+      </w:pPr>
+    </w:p>
+    <w:p>
+      <w:r>
+        <w:rPr>
+          <w:lang w:val="en-US"/>
+        </w:rPr>
+        <w:t>Delta map?</w:t>
+      </w:r>
+    </w:p>
     <w:p/>
     <w:p/>
     <w:p/>

</xml_diff>